<commit_message>
Finalize IJDSA assets: corrected data span, expanded supplementary, resubmission cover letter
- Fix study period to May 2015-December 2024 (was incorrectly Jan2015-Aug2024)
  in manuscript and supplementary.
- Expand supplementary: data-sources table (S2), full 15-state scorecard (S10),
  verified package versions (S11), and a REAL West Bengal-exclusion sensitivity
  result (dR2 = 0.003, hierarchy preserved) replacing the asserted claim.
- Add dedicated resubmission cover letter (md + docx).
- Cross-document numeric consistency verified (R2 0.892 / RMSE 232 / AUC 0.936 /
  GDP rho 0.51 / 1,740 state-months agree across all files).

Co-Authored-By: Claude Opus 4.8 <noreply@anthropic.com>
</commit_message>
<xml_diff>
--- a/MMI_submission_package/Supplementary_IJDSA.docx
+++ b/MMI_submission_package/Supplementary_IJDSA.docx
@@ -2,7 +2,7 @@
 <file path=word/document.xml><?xml version="1.0" encoding="utf-8"?>
 <w:document xmlns:w="http://schemas.openxmlformats.org/wordprocessingml/2006/main" xmlns:m="http://schemas.openxmlformats.org/officeDocument/2006/math" xmlns:r="http://schemas.openxmlformats.org/officeDocument/2006/relationships" xmlns:o="urn:schemas-microsoft-com:office:office" xmlns:v="urn:schemas-microsoft-com:vml" xmlns:w10="urn:schemas-microsoft-com:office:word" xmlns:a="http://schemas.openxmlformats.org/drawingml/2006/main" xmlns:pic="http://schemas.openxmlformats.org/drawingml/2006/picture" xmlns:wp="http://schemas.openxmlformats.org/drawingml/2006/wordprocessingDrawing">
   <w:body>
-    <w:bookmarkStart w:id="18" w:name="supplementary-material"/>
+    <w:bookmarkStart w:id="20" w:name="supplementary-material"/>
     <w:p>
       <w:pPr>
         <w:pStyle w:val="Heading1"/>
@@ -28,7 +28,7 @@
         <w:pStyle w:val="BodyText"/>
       </w:pPr>
       <w:r>
-        <w:t xml:space="preserve">This supplement documents the data, full predictor set, validation detail and sensitivity analyses underpinning the main text. All items are regenerable from the released pipeline (</w:t>
+        <w:t xml:space="preserve">This supplement documents the data sources, full predictor set, validation detail and sensitivity analyses underpinning the main text. Every item is regenerable from the released pipeline (</w:t>
       </w:r>
       <w:r>
         <w:rPr>
@@ -74,7 +74,17 @@
         <w:t xml:space="preserve"> </w:t>
       </w:r>
       <w:r>
-        <w:t xml:space="preserve">= 15 states × 116 months (January 2015 – August 2024).</w:t>
+        <w:t xml:space="preserve">= 15 states × 116 months (</w:t>
+      </w:r>
+      <w:r>
+        <w:rPr>
+          <w:b/>
+          <w:bCs/>
+        </w:rPr>
+        <w:t xml:space="preserve">May 2015 – December 2024</w:t>
+      </w:r>
+      <w:r>
+        <w:t xml:space="preserve">).</w:t>
       </w:r>
     </w:p>
     <w:p>
@@ -98,17 +108,388 @@
         </w:numPr>
       </w:pPr>
       <w:r>
-        <w:t xml:space="preserve">Cumulative reported cases in panel: 1,266,346.</w:t>
+        <w:t xml:space="preserve">Cumulative reported cases in panel:</w:t>
+      </w:r>
+      <w:r>
+        <w:t xml:space="preserve"> </w:t>
+      </w:r>
+      <w:r>
+        <w:rPr>
+          <w:b/>
+          <w:bCs/>
+        </w:rPr>
+        <w:t xml:space="preserve">1,266,346</w:t>
+      </w:r>
+      <w:r>
+        <w:t xml:space="preserve">.</w:t>
+      </w:r>
+    </w:p>
+    <w:p>
+      <w:pPr>
+        <w:pStyle w:val="Compact"/>
+        <w:numPr>
+          <w:ilvl w:val="0"/>
+          <w:numId w:val="1001"/>
+        </w:numPr>
+      </w:pPr>
+      <w:r>
+        <w:t xml:space="preserve">States were retained only where continuous monthly reporting was available; states with sparse or annual-only data were excluded rather than disaggregated to monthly resolution.</w:t>
       </w:r>
     </w:p>
     <w:bookmarkEnd w:id="9"/>
-    <w:bookmarkStart w:id="10" w:name="X8ec0b9238e1faaf53abe78bfc77e0500885b516"/>
+    <w:bookmarkStart w:id="10" w:name="s2.-data-sources"/>
     <w:p>
       <w:pPr>
         <w:pStyle w:val="Heading2"/>
       </w:pPr>
       <w:r>
-        <w:t xml:space="preserve">S2. Full feature set (25 predictors, four blocks)</w:t>
+        <w:t xml:space="preserve">S2. Data sources</w:t>
+      </w:r>
+    </w:p>
+    <w:tbl>
+      <w:tblPr>
+        <w:tblStyle w:val="Table"/>
+        <w:tblW w:type="pct" w:w="5000"/>
+        <w:tblLayout w:type="fixed"/>
+        <w:tblLook w:firstRow="1" w:lastRow="0" w:firstColumn="0" w:lastColumn="0" w:noHBand="0" w:noVBand="0" w:val="0020"/>
+      </w:tblPr>
+      <w:tblGrid>
+        <w:gridCol w:w="2640"/>
+        <w:gridCol w:w="2640"/>
+        <w:gridCol w:w="2640"/>
+      </w:tblGrid>
+      <w:tr>
+        <w:trPr>
+          <w:tblHeader w:val="on"/>
+        </w:trPr>
+        <w:tc>
+          <w:tcPr/>
+          <w:p>
+            <w:pPr>
+              <w:pStyle w:val="Compact"/>
+              <w:jc w:val="left"/>
+            </w:pPr>
+            <w:r>
+              <w:t xml:space="preserve">Domain</w:t>
+            </w:r>
+          </w:p>
+        </w:tc>
+        <w:tc>
+          <w:tcPr/>
+          <w:p>
+            <w:pPr>
+              <w:pStyle w:val="Compact"/>
+              <w:jc w:val="left"/>
+            </w:pPr>
+            <w:r>
+              <w:t xml:space="preserve">Source</w:t>
+            </w:r>
+          </w:p>
+        </w:tc>
+        <w:tc>
+          <w:tcPr/>
+          <w:p>
+            <w:pPr>
+              <w:pStyle w:val="Compact"/>
+              <w:jc w:val="left"/>
+            </w:pPr>
+            <w:r>
+              <w:t xml:space="preserve">Access</w:t>
+            </w:r>
+          </w:p>
+        </w:tc>
+      </w:tr>
+      <w:tr>
+        <w:tc>
+          <w:tcPr/>
+          <w:p>
+            <w:pPr>
+              <w:pStyle w:val="Compact"/>
+              <w:jc w:val="left"/>
+            </w:pPr>
+            <w:r>
+              <w:t xml:space="preserve">Dengue case counts</w:t>
+            </w:r>
+          </w:p>
+        </w:tc>
+        <w:tc>
+          <w:tcPr/>
+          <w:p>
+            <w:pPr>
+              <w:pStyle w:val="Compact"/>
+              <w:jc w:val="left"/>
+            </w:pPr>
+            <w:r>
+              <w:t xml:space="preserve">National Vector Borne Disease Control Programme (NVBDCP / NCVBDC)</w:t>
+            </w:r>
+          </w:p>
+        </w:tc>
+        <w:tc>
+          <w:tcPr/>
+          <w:p>
+            <w:pPr>
+              <w:pStyle w:val="Compact"/>
+              <w:jc w:val="left"/>
+            </w:pPr>
+            <w:r>
+              <w:t xml:space="preserve">https://ncvbdc.mohfw.gov.in (accessed 5 Jan 2025)</w:t>
+            </w:r>
+          </w:p>
+        </w:tc>
+      </w:tr>
+      <w:tr>
+        <w:tc>
+          <w:tcPr/>
+          <w:p>
+            <w:pPr>
+              <w:pStyle w:val="Compact"/>
+              <w:jc w:val="left"/>
+            </w:pPr>
+            <w:r>
+              <w:t xml:space="preserve">Case-count reconciliation</w:t>
+            </w:r>
+          </w:p>
+        </w:tc>
+        <w:tc>
+          <w:tcPr/>
+          <w:p>
+            <w:pPr>
+              <w:pStyle w:val="Compact"/>
+              <w:jc w:val="left"/>
+            </w:pPr>
+            <w:r>
+              <w:t xml:space="preserve">OpenDengue v1.x (Clarke et al.,</w:t>
+            </w:r>
+            <w:r>
+              <w:t xml:space="preserve"> </w:t>
+            </w:r>
+            <w:r>
+              <w:rPr>
+                <w:i/>
+                <w:iCs/>
+              </w:rPr>
+              <w:t xml:space="preserve">Sci Data</w:t>
+            </w:r>
+            <w:r>
+              <w:t xml:space="preserve"> </w:t>
+            </w:r>
+            <w:r>
+              <w:t xml:space="preserve">2024)</w:t>
+            </w:r>
+          </w:p>
+        </w:tc>
+        <w:tc>
+          <w:tcPr/>
+          <w:p>
+            <w:pPr>
+              <w:pStyle w:val="Compact"/>
+              <w:jc w:val="left"/>
+            </w:pPr>
+            <w:r>
+              <w:t xml:space="preserve">https://opendengue.org (accessed 5 Jan 2025)</w:t>
+            </w:r>
+          </w:p>
+        </w:tc>
+      </w:tr>
+      <w:tr>
+        <w:tc>
+          <w:tcPr/>
+          <w:p>
+            <w:pPr>
+              <w:pStyle w:val="Compact"/>
+              <w:jc w:val="left"/>
+            </w:pPr>
+            <w:r>
+              <w:t xml:space="preserve">Climate (temperature, rainfall, humidity)</w:t>
+            </w:r>
+          </w:p>
+        </w:tc>
+        <w:tc>
+          <w:tcPr/>
+          <w:p>
+            <w:pPr>
+              <w:pStyle w:val="Compact"/>
+              <w:jc w:val="left"/>
+            </w:pPr>
+            <w:r>
+              <w:t xml:space="preserve">India Meteorological Department gridded products</w:t>
+            </w:r>
+          </w:p>
+        </w:tc>
+        <w:tc>
+          <w:tcPr/>
+          <w:p>
+            <w:pPr>
+              <w:pStyle w:val="Compact"/>
+              <w:jc w:val="left"/>
+            </w:pPr>
+            <w:r>
+              <w:t xml:space="preserve">IMD</w:t>
+            </w:r>
+          </w:p>
+        </w:tc>
+      </w:tr>
+      <w:tr>
+        <w:tc>
+          <w:tcPr/>
+          <w:p>
+            <w:pPr>
+              <w:pStyle w:val="Compact"/>
+              <w:jc w:val="left"/>
+            </w:pPr>
+            <w:r>
+              <w:t xml:space="preserve">Health system capacity</w:t>
+            </w:r>
+          </w:p>
+        </w:tc>
+        <w:tc>
+          <w:tcPr/>
+          <w:p>
+            <w:pPr>
+              <w:pStyle w:val="Compact"/>
+              <w:jc w:val="left"/>
+            </w:pPr>
+            <w:r>
+              <w:t xml:space="preserve">NITI Aayog Health Index 2019-20 (Round IV)</w:t>
+            </w:r>
+          </w:p>
+        </w:tc>
+        <w:tc>
+          <w:tcPr/>
+          <w:p>
+            <w:pPr>
+              <w:pStyle w:val="Compact"/>
+              <w:jc w:val="left"/>
+            </w:pPr>
+            <w:r>
+              <w:t xml:space="preserve">NITI Aayog, 2021</w:t>
+            </w:r>
+          </w:p>
+        </w:tc>
+      </w:tr>
+      <w:tr>
+        <w:tc>
+          <w:tcPr/>
+          <w:p>
+            <w:pPr>
+              <w:pStyle w:val="Compact"/>
+              <w:jc w:val="left"/>
+            </w:pPr>
+            <w:r>
+              <w:t xml:space="preserve">Economic</w:t>
+            </w:r>
+          </w:p>
+        </w:tc>
+        <w:tc>
+          <w:tcPr/>
+          <w:p>
+            <w:pPr>
+              <w:pStyle w:val="Compact"/>
+              <w:jc w:val="left"/>
+            </w:pPr>
+            <w:r>
+              <w:t xml:space="preserve">State GDP per capita</w:t>
+            </w:r>
+          </w:p>
+        </w:tc>
+        <w:tc>
+          <w:tcPr/>
+          <w:p>
+            <w:pPr>
+              <w:pStyle w:val="Compact"/>
+              <w:jc w:val="left"/>
+            </w:pPr>
+            <w:r>
+              <w:t xml:space="preserve">Government of India / MoSPI</w:t>
+            </w:r>
+          </w:p>
+        </w:tc>
+      </w:tr>
+      <w:tr>
+        <w:tc>
+          <w:tcPr/>
+          <w:p>
+            <w:pPr>
+              <w:pStyle w:val="Compact"/>
+              <w:jc w:val="left"/>
+            </w:pPr>
+            <w:r>
+              <w:t xml:space="preserve">Environmental resilience</w:t>
+            </w:r>
+          </w:p>
+        </w:tc>
+        <w:tc>
+          <w:tcPr/>
+          <w:p>
+            <w:pPr>
+              <w:pStyle w:val="Compact"/>
+              <w:jc w:val="left"/>
+            </w:pPr>
+            <w:r>
+              <w:t xml:space="preserve">State Energy &amp; Climate Index (SECI), Round I</w:t>
+            </w:r>
+          </w:p>
+        </w:tc>
+        <w:tc>
+          <w:tcPr/>
+          <w:p>
+            <w:pPr>
+              <w:pStyle w:val="Compact"/>
+              <w:jc w:val="left"/>
+            </w:pPr>
+            <w:r>
+              <w:t xml:space="preserve">NITI Aayog</w:t>
+            </w:r>
+          </w:p>
+        </w:tc>
+      </w:tr>
+      <w:tr>
+        <w:tc>
+          <w:tcPr/>
+          <w:p>
+            <w:pPr>
+              <w:pStyle w:val="Compact"/>
+              <w:jc w:val="left"/>
+            </w:pPr>
+            <w:r>
+              <w:t xml:space="preserve">Urbanisation &amp; density</w:t>
+            </w:r>
+          </w:p>
+        </w:tc>
+        <w:tc>
+          <w:tcPr/>
+          <w:p>
+            <w:pPr>
+              <w:pStyle w:val="Compact"/>
+              <w:jc w:val="left"/>
+            </w:pPr>
+            <w:r>
+              <w:t xml:space="preserve">Census of India 2011 (urban share, population density)</w:t>
+            </w:r>
+          </w:p>
+        </w:tc>
+        <w:tc>
+          <w:tcPr/>
+          <w:p>
+            <w:pPr>
+              <w:pStyle w:val="Compact"/>
+              <w:jc w:val="left"/>
+            </w:pPr>
+            <w:r>
+              <w:t xml:space="preserve">Census 2011</w:t>
+            </w:r>
+          </w:p>
+        </w:tc>
+      </w:tr>
+    </w:tbl>
+    <w:bookmarkEnd w:id="10"/>
+    <w:bookmarkStart w:id="11" w:name="Xc1fbb49177220818c8e5c93965f6e9ba4f4576b"/>
+    <w:p>
+      <w:pPr>
+        <w:pStyle w:val="Heading2"/>
+      </w:pPr>
+      <w:r>
+        <w:t xml:space="preserve">S3. Full feature set (25 predictors, four blocks)</w:t>
       </w:r>
     </w:p>
     <w:tbl>
@@ -256,14 +637,14 @@
         </w:tc>
       </w:tr>
     </w:tbl>
-    <w:bookmarkEnd w:id="10"/>
-    <w:bookmarkStart w:id="11" w:name="s3.-model-configuration"/>
+    <w:bookmarkEnd w:id="11"/>
+    <w:bookmarkStart w:id="12" w:name="s4.-model-configuration"/>
     <w:p>
       <w:pPr>
         <w:pStyle w:val="Heading2"/>
       </w:pPr>
       <w:r>
-        <w:t xml:space="preserve">S3. Model configuration</w:t>
+        <w:t xml:space="preserve">S4. Model configuration</w:t>
       </w:r>
     </w:p>
     <w:p>
@@ -307,7 +688,7 @@
         <w:t xml:space="preserve"> </w:t>
       </w:r>
       <w:r>
-        <w:t xml:space="preserve">GradientBoostingClassifier (same ensemble settings); outbreak = month above the state-specific 75th percentile of cases (435/1,740 positives; 25%).</w:t>
+        <w:t xml:space="preserve">GradientBoostingClassifier (same ensemble settings); outbreak = month above the state-specific 75th percentile of cases (435/1,740 positives; 25.0%).</w:t>
       </w:r>
     </w:p>
     <w:p>
@@ -319,17 +700,17 @@
         </w:numPr>
       </w:pPr>
       <w:r>
-        <w:t xml:space="preserve">Hyperparameters fixed a priori (no tuning on test folds).</w:t>
+        <w:t xml:space="preserve">Hyperparameters fixed a priori (no tuning on test folds), eliminating validation leakage.</w:t>
       </w:r>
     </w:p>
-    <w:bookmarkEnd w:id="11"/>
-    <w:bookmarkStart w:id="12" w:name="Xf36f0120d98b1780965b84ca71e2f9daa640953"/>
+    <w:bookmarkEnd w:id="12"/>
+    <w:bookmarkStart w:id="13" w:name="Xadc907b1e87d54a8287f8b034ef19561ac83cee"/>
     <w:p>
       <w:pPr>
         <w:pStyle w:val="Heading2"/>
       </w:pPr>
       <w:r>
-        <w:t xml:space="preserve">S4. Cross-validation detail (5-fold blocked TimeSeriesSplit, case scale)</w:t>
+        <w:t xml:space="preserve">S5. Cross-validation detail (5-fold blocked TimeSeriesSplit, case scale)</w:t>
       </w:r>
     </w:p>
     <w:tbl>
@@ -720,17 +1101,17 @@
         <w:pStyle w:val="BodyText"/>
       </w:pPr>
       <w:r>
-        <w:t xml:space="preserve">Classifier: pooled out-of-fold AUC = 0.936; mean per-fold AUC = 0.938 ± 0.018; sensitivity (Youden) = 0.909.</w:t>
+        <w:t xml:space="preserve">Classifier: pooled out-of-fold AUC = 0.936; mean per-fold AUC = 0.938 ± 0.018; sensitivity (Youden-optimal threshold) = 0.909.</w:t>
       </w:r>
     </w:p>
-    <w:bookmarkEnd w:id="12"/>
-    <w:bookmarkStart w:id="13" w:name="X4e58dffb3df70afef8573060c110a3ed9142ed3"/>
+    <w:bookmarkEnd w:id="13"/>
+    <w:bookmarkStart w:id="14" w:name="Xee9d1269be2e29b35e8a41cd5e3fb224a5104f7"/>
     <w:p>
       <w:pPr>
         <w:pStyle w:val="Heading2"/>
       </w:pPr>
       <w:r>
-        <w:t xml:space="preserve">S5. Driver decomposition (grouped Gini importance)</w:t>
+        <w:t xml:space="preserve">S6. Driver decomposition (grouped Gini importance)</w:t>
       </w:r>
     </w:p>
     <w:tbl>
@@ -882,17 +1263,17 @@
         <w:pStyle w:val="BodyText"/>
       </w:pPr>
       <w:r>
-        <w:t xml:space="preserve">Leading individual features: month_sin (70.0%), cases_rolling3 (18.1%), month_cos (3.8%), urban_pct (3.0%), cases_lag1 (1.3%), health_index (0.7%).</w:t>
+        <w:t xml:space="preserve">Leading individual features: month_sin (70.0%), cases_rolling3 (18.1%), month_cos (3.8%), urban_pct_2011 (3.0%), cases_lag1 (1.3%), health_index_2019_20 (0.7%).</w:t>
       </w:r>
     </w:p>
-    <w:bookmarkEnd w:id="13"/>
-    <w:bookmarkStart w:id="14" w:name="X3635493c991b2da0442670260762531a16daa1e"/>
+    <w:bookmarkEnd w:id="14"/>
+    <w:bookmarkStart w:id="15" w:name="Xaf56c61aa87df4572201b338cf77625de3c2d87"/>
     <w:p>
       <w:pPr>
         <w:pStyle w:val="Heading2"/>
       </w:pPr>
       <w:r>
-        <w:t xml:space="preserve">S6. Between-state vulnerability association (Spearman, n = 15 states)</w:t>
+        <w:t xml:space="preserve">S7. Between-state vulnerability association (Spearman, n = 15 states)</w:t>
       </w:r>
     </w:p>
     <w:tbl>
@@ -1062,14 +1443,14 @@
         </w:tc>
       </w:tr>
     </w:tbl>
-    <w:bookmarkEnd w:id="14"/>
-    <w:bookmarkStart w:id="15" w:name="s7.-field-scorecard-validation"/>
+    <w:bookmarkEnd w:id="15"/>
+    <w:bookmarkStart w:id="16" w:name="s8.-field-scorecard-validation"/>
     <w:p>
       <w:pPr>
         <w:pStyle w:val="Heading2"/>
       </w:pPr>
       <w:r>
-        <w:t xml:space="preserve">S7. Field Scorecard validation</w:t>
+        <w:t xml:space="preserve">S8. Field Scorecard validation</w:t>
       </w:r>
     </w:p>
     <w:p>
@@ -1096,14 +1477,14 @@
         <w:t xml:space="preserve">across all 1,740 state-months.</w:t>
       </w:r>
     </w:p>
-    <w:bookmarkEnd w:id="15"/>
-    <w:bookmarkStart w:id="16" w:name="s8.-sensitivity-data-notes"/>
+    <w:bookmarkEnd w:id="16"/>
+    <w:bookmarkStart w:id="17" w:name="s9.-sensitivity-analysis-and-data-notes"/>
     <w:p>
       <w:pPr>
         <w:pStyle w:val="Heading2"/>
       </w:pPr>
       <w:r>
-        <w:t xml:space="preserve">S8. Sensitivity / data notes</w:t>
+        <w:t xml:space="preserve">S9. Sensitivity analysis and data notes</w:t>
       </w:r>
     </w:p>
     <w:p>
@@ -1115,7 +1496,43 @@
         </w:numPr>
       </w:pPr>
       <w:r>
-        <w:t xml:space="preserve">The NITI Aayog Health Index 2019-20 value for West Bengal was absent in the source CSV and median-imputed. Re-running the pipeline excluding West Bengal changed the headline cross-validated R² by &lt; 0.01 and did not alter the driver hierarchy, confirming the imputation is non-influential.</w:t>
+        <w:rPr>
+          <w:b/>
+          <w:bCs/>
+        </w:rPr>
+        <w:t xml:space="preserve">Missing-value sensitivity.</w:t>
+      </w:r>
+      <w:r>
+        <w:t xml:space="preserve"> </w:t>
+      </w:r>
+      <w:r>
+        <w:t xml:space="preserve">The NITI Aayog Health Index 2019-20 value for West Bengal was absent in the source release and median-imputed. Re-running the full cross-validation</w:t>
+      </w:r>
+      <w:r>
+        <w:t xml:space="preserve"> </w:t>
+      </w:r>
+      <w:r>
+        <w:rPr>
+          <w:b/>
+          <w:bCs/>
+        </w:rPr>
+        <w:t xml:space="preserve">excluding West Bengal</w:t>
+      </w:r>
+      <w:r>
+        <w:t xml:space="preserve"> </w:t>
+      </w:r>
+      <w:r>
+        <w:t xml:space="preserve">changed the headline R² from 0.8925 to 0.8899 (</w:t>
+      </w:r>
+      <w:r>
+        <w:rPr>
+          <w:b/>
+          <w:bCs/>
+        </w:rPr>
+        <w:t xml:space="preserve">ΔR² = 0.003</w:t>
+      </w:r>
+      <w:r>
+        <w:t xml:space="preserve">) and preserved the driver hierarchy (seasonality 74.5%, autoregressive 18.3%, vulnerability 6.2%, climate 1.0%). The imputation is therefore non-influential.</w:t>
       </w:r>
     </w:p>
     <w:p>
@@ -1127,17 +1544,1055 @@
         </w:numPr>
       </w:pPr>
       <w:r>
-        <w:t xml:space="preserve">Structural covariates are single-year (static) and therefore inform between-state contrasts rather than within-state temporal change.</w:t>
+        <w:rPr>
+          <w:b/>
+          <w:bCs/>
+        </w:rPr>
+        <w:t xml:space="preserve">Static covariates.</w:t>
+      </w:r>
+      <w:r>
+        <w:t xml:space="preserve"> </w:t>
+      </w:r>
+      <w:r>
+        <w:t xml:space="preserve">Structural indices are single-year and inform between-state contrasts rather than within-state temporal change; this is why they contribute modestly to month-ahead prediction yet pattern cross-state burden (S7).</w:t>
       </w:r>
     </w:p>
-    <w:bookmarkEnd w:id="16"/>
-    <w:bookmarkStart w:id="17" w:name="s9.-reproducibility"/>
+    <w:bookmarkEnd w:id="17"/>
+    <w:bookmarkStart w:id="18" w:name="Xe7fdd1075c56a07c30af93466cd1043ef9da99c"/>
     <w:p>
       <w:pPr>
         <w:pStyle w:val="Heading2"/>
       </w:pPr>
       <w:r>
-        <w:t xml:space="preserve">S9. Reproducibility</w:t>
+        <w:t xml:space="preserve">S10. Full state risk scorecard (all 15 states)</w:t>
+      </w:r>
+    </w:p>
+    <w:tbl>
+      <w:tblPr>
+        <w:tblStyle w:val="Table"/>
+        <w:tblW w:type="pct" w:w="5000"/>
+        <w:tblLayout w:type="fixed"/>
+        <w:tblLook w:firstRow="1" w:lastRow="0" w:firstColumn="0" w:lastColumn="0" w:noHBand="0" w:noVBand="0" w:val="0020"/>
+      </w:tblPr>
+      <w:tblGrid>
+        <w:gridCol w:w="1584"/>
+        <w:gridCol w:w="1584"/>
+        <w:gridCol w:w="1584"/>
+        <w:gridCol w:w="1584"/>
+        <w:gridCol w:w="1584"/>
+      </w:tblGrid>
+      <w:tr>
+        <w:trPr>
+          <w:tblHeader w:val="on"/>
+        </w:trPr>
+        <w:tc>
+          <w:tcPr/>
+          <w:p>
+            <w:pPr>
+              <w:pStyle w:val="Compact"/>
+              <w:jc w:val="left"/>
+            </w:pPr>
+            <w:r>
+              <w:t xml:space="preserve">State</w:t>
+            </w:r>
+          </w:p>
+        </w:tc>
+        <w:tc>
+          <w:tcPr/>
+          <w:p>
+            <w:pPr>
+              <w:pStyle w:val="Compact"/>
+              <w:jc w:val="left"/>
+            </w:pPr>
+            <w:r>
+              <w:t xml:space="preserve">Forecast cases</w:t>
+            </w:r>
+          </w:p>
+        </w:tc>
+        <w:tc>
+          <w:tcPr/>
+          <w:p>
+            <w:pPr>
+              <w:pStyle w:val="Compact"/>
+              <w:jc w:val="left"/>
+            </w:pPr>
+            <w:r>
+              <w:t xml:space="preserve">Health Index (2019-20)</w:t>
+            </w:r>
+          </w:p>
+        </w:tc>
+        <w:tc>
+          <w:tcPr/>
+          <w:p>
+            <w:pPr>
+              <w:pStyle w:val="Compact"/>
+              <w:jc w:val="left"/>
+            </w:pPr>
+            <w:r>
+              <w:t xml:space="preserve">Risk score (0–100)</w:t>
+            </w:r>
+          </w:p>
+        </w:tc>
+        <w:tc>
+          <w:tcPr/>
+          <w:p>
+            <w:pPr>
+              <w:pStyle w:val="Compact"/>
+              <w:jc w:val="left"/>
+            </w:pPr>
+            <w:r>
+              <w:t xml:space="preserve">Category</w:t>
+            </w:r>
+          </w:p>
+        </w:tc>
+      </w:tr>
+      <w:tr>
+        <w:tc>
+          <w:tcPr/>
+          <w:p>
+            <w:pPr>
+              <w:pStyle w:val="Compact"/>
+              <w:jc w:val="left"/>
+            </w:pPr>
+            <w:r>
+              <w:t xml:space="preserve">West Bengal</w:t>
+            </w:r>
+          </w:p>
+        </w:tc>
+        <w:tc>
+          <w:tcPr/>
+          <w:p>
+            <w:pPr>
+              <w:pStyle w:val="Compact"/>
+              <w:jc w:val="left"/>
+            </w:pPr>
+            <w:r>
+              <w:t xml:space="preserve">1,658</w:t>
+            </w:r>
+          </w:p>
+        </w:tc>
+        <w:tc>
+          <w:tcPr/>
+          <w:p>
+            <w:pPr>
+              <w:pStyle w:val="Compact"/>
+              <w:jc w:val="left"/>
+            </w:pPr>
+            <w:r>
+              <w:t xml:space="preserve">51.3*</w:t>
+            </w:r>
+          </w:p>
+        </w:tc>
+        <w:tc>
+          <w:tcPr/>
+          <w:p>
+            <w:pPr>
+              <w:pStyle w:val="Compact"/>
+              <w:jc w:val="left"/>
+            </w:pPr>
+            <w:r>
+              <w:t xml:space="preserve">100.0</w:t>
+            </w:r>
+          </w:p>
+        </w:tc>
+        <w:tc>
+          <w:tcPr/>
+          <w:p>
+            <w:pPr>
+              <w:pStyle w:val="Compact"/>
+              <w:jc w:val="left"/>
+            </w:pPr>
+            <w:r>
+              <w:t xml:space="preserve">High</w:t>
+            </w:r>
+          </w:p>
+        </w:tc>
+      </w:tr>
+      <w:tr>
+        <w:tc>
+          <w:tcPr/>
+          <w:p>
+            <w:pPr>
+              <w:pStyle w:val="Compact"/>
+              <w:jc w:val="left"/>
+            </w:pPr>
+            <w:r>
+              <w:t xml:space="preserve">Tamil Nadu</w:t>
+            </w:r>
+          </w:p>
+        </w:tc>
+        <w:tc>
+          <w:tcPr/>
+          <w:p>
+            <w:pPr>
+              <w:pStyle w:val="Compact"/>
+              <w:jc w:val="left"/>
+            </w:pPr>
+            <w:r>
+              <w:t xml:space="preserve">1,411</w:t>
+            </w:r>
+          </w:p>
+        </w:tc>
+        <w:tc>
+          <w:tcPr/>
+          <w:p>
+            <w:pPr>
+              <w:pStyle w:val="Compact"/>
+              <w:jc w:val="left"/>
+            </w:pPr>
+            <w:r>
+              <w:t xml:space="preserve">69.1</w:t>
+            </w:r>
+          </w:p>
+        </w:tc>
+        <w:tc>
+          <w:tcPr/>
+          <w:p>
+            <w:pPr>
+              <w:pStyle w:val="Compact"/>
+              <w:jc w:val="left"/>
+            </w:pPr>
+            <w:r>
+              <w:t xml:space="preserve">74.8</w:t>
+            </w:r>
+          </w:p>
+        </w:tc>
+        <w:tc>
+          <w:tcPr/>
+          <w:p>
+            <w:pPr>
+              <w:pStyle w:val="Compact"/>
+              <w:jc w:val="left"/>
+            </w:pPr>
+            <w:r>
+              <w:t xml:space="preserve">High</w:t>
+            </w:r>
+          </w:p>
+        </w:tc>
+      </w:tr>
+      <w:tr>
+        <w:tc>
+          <w:tcPr/>
+          <w:p>
+            <w:pPr>
+              <w:pStyle w:val="Compact"/>
+              <w:jc w:val="left"/>
+            </w:pPr>
+            <w:r>
+              <w:t xml:space="preserve">Karnataka</w:t>
+            </w:r>
+          </w:p>
+        </w:tc>
+        <w:tc>
+          <w:tcPr/>
+          <w:p>
+            <w:pPr>
+              <w:pStyle w:val="Compact"/>
+              <w:jc w:val="left"/>
+            </w:pPr>
+            <w:r>
+              <w:t xml:space="preserve">1,059</w:t>
+            </w:r>
+          </w:p>
+        </w:tc>
+        <w:tc>
+          <w:tcPr/>
+          <w:p>
+            <w:pPr>
+              <w:pStyle w:val="Compact"/>
+              <w:jc w:val="left"/>
+            </w:pPr>
+            <w:r>
+              <w:t xml:space="preserve">49.3</w:t>
+            </w:r>
+          </w:p>
+        </w:tc>
+        <w:tc>
+          <w:tcPr/>
+          <w:p>
+            <w:pPr>
+              <w:pStyle w:val="Compact"/>
+              <w:jc w:val="left"/>
+            </w:pPr>
+            <w:r>
+              <w:t xml:space="preserve">73.2</w:t>
+            </w:r>
+          </w:p>
+        </w:tc>
+        <w:tc>
+          <w:tcPr/>
+          <w:p>
+            <w:pPr>
+              <w:pStyle w:val="Compact"/>
+              <w:jc w:val="left"/>
+            </w:pPr>
+            <w:r>
+              <w:t xml:space="preserve">High</w:t>
+            </w:r>
+          </w:p>
+        </w:tc>
+      </w:tr>
+      <w:tr>
+        <w:tc>
+          <w:tcPr/>
+          <w:p>
+            <w:pPr>
+              <w:pStyle w:val="Compact"/>
+              <w:jc w:val="left"/>
+            </w:pPr>
+            <w:r>
+              <w:t xml:space="preserve">Maharashtra</w:t>
+            </w:r>
+          </w:p>
+        </w:tc>
+        <w:tc>
+          <w:tcPr/>
+          <w:p>
+            <w:pPr>
+              <w:pStyle w:val="Compact"/>
+              <w:jc w:val="left"/>
+            </w:pPr>
+            <w:r>
+              <w:t xml:space="preserve">1,097</w:t>
+            </w:r>
+          </w:p>
+        </w:tc>
+        <w:tc>
+          <w:tcPr/>
+          <w:p>
+            <w:pPr>
+              <w:pStyle w:val="Compact"/>
+              <w:jc w:val="left"/>
+            </w:pPr>
+            <w:r>
+              <w:t xml:space="preserve">57.9</w:t>
+            </w:r>
+          </w:p>
+        </w:tc>
+        <w:tc>
+          <w:tcPr/>
+          <w:p>
+            <w:pPr>
+              <w:pStyle w:val="Compact"/>
+              <w:jc w:val="left"/>
+            </w:pPr>
+            <w:r>
+              <w:t xml:space="preserve">68.2</w:t>
+            </w:r>
+          </w:p>
+        </w:tc>
+        <w:tc>
+          <w:tcPr/>
+          <w:p>
+            <w:pPr>
+              <w:pStyle w:val="Compact"/>
+              <w:jc w:val="left"/>
+            </w:pPr>
+            <w:r>
+              <w:t xml:space="preserve">Moderate</w:t>
+            </w:r>
+          </w:p>
+        </w:tc>
+      </w:tr>
+      <w:tr>
+        <w:tc>
+          <w:tcPr/>
+          <w:p>
+            <w:pPr>
+              <w:pStyle w:val="Compact"/>
+              <w:jc w:val="left"/>
+            </w:pPr>
+            <w:r>
+              <w:t xml:space="preserve">Delhi</w:t>
+            </w:r>
+          </w:p>
+        </w:tc>
+        <w:tc>
+          <w:tcPr/>
+          <w:p>
+            <w:pPr>
+              <w:pStyle w:val="Compact"/>
+              <w:jc w:val="left"/>
+            </w:pPr>
+            <w:r>
+              <w:t xml:space="preserve">847</w:t>
+            </w:r>
+          </w:p>
+        </w:tc>
+        <w:tc>
+          <w:tcPr/>
+          <w:p>
+            <w:pPr>
+              <w:pStyle w:val="Compact"/>
+              <w:jc w:val="left"/>
+            </w:pPr>
+            <w:r>
+              <w:t xml:space="preserve">51.9</w:t>
+            </w:r>
+          </w:p>
+        </w:tc>
+        <w:tc>
+          <w:tcPr/>
+          <w:p>
+            <w:pPr>
+              <w:pStyle w:val="Compact"/>
+              <w:jc w:val="left"/>
+            </w:pPr>
+            <w:r>
+              <w:t xml:space="preserve">56.8</w:t>
+            </w:r>
+          </w:p>
+        </w:tc>
+        <w:tc>
+          <w:tcPr/>
+          <w:p>
+            <w:pPr>
+              <w:pStyle w:val="Compact"/>
+              <w:jc w:val="left"/>
+            </w:pPr>
+            <w:r>
+              <w:t xml:space="preserve">Moderate</w:t>
+            </w:r>
+          </w:p>
+        </w:tc>
+      </w:tr>
+      <w:tr>
+        <w:tc>
+          <w:tcPr/>
+          <w:p>
+            <w:pPr>
+              <w:pStyle w:val="Compact"/>
+              <w:jc w:val="left"/>
+            </w:pPr>
+            <w:r>
+              <w:t xml:space="preserve">Rajasthan</w:t>
+            </w:r>
+          </w:p>
+        </w:tc>
+        <w:tc>
+          <w:tcPr/>
+          <w:p>
+            <w:pPr>
+              <w:pStyle w:val="Compact"/>
+              <w:jc w:val="left"/>
+            </w:pPr>
+            <w:r>
+              <w:t xml:space="preserve">694</w:t>
+            </w:r>
+          </w:p>
+        </w:tc>
+        <w:tc>
+          <w:tcPr/>
+          <w:p>
+            <w:pPr>
+              <w:pStyle w:val="Compact"/>
+              <w:jc w:val="left"/>
+            </w:pPr>
+            <w:r>
+              <w:t xml:space="preserve">41.3</w:t>
+            </w:r>
+          </w:p>
+        </w:tc>
+        <w:tc>
+          <w:tcPr/>
+          <w:p>
+            <w:pPr>
+              <w:pStyle w:val="Compact"/>
+              <w:jc w:val="left"/>
+            </w:pPr>
+            <w:r>
+              <w:t xml:space="preserve">53.0</w:t>
+            </w:r>
+          </w:p>
+        </w:tc>
+        <w:tc>
+          <w:tcPr/>
+          <w:p>
+            <w:pPr>
+              <w:pStyle w:val="Compact"/>
+              <w:jc w:val="left"/>
+            </w:pPr>
+            <w:r>
+              <w:t xml:space="preserve">Moderate</w:t>
+            </w:r>
+          </w:p>
+        </w:tc>
+      </w:tr>
+      <w:tr>
+        <w:tc>
+          <w:tcPr/>
+          <w:p>
+            <w:pPr>
+              <w:pStyle w:val="Compact"/>
+              <w:jc w:val="left"/>
+            </w:pPr>
+            <w:r>
+              <w:t xml:space="preserve">Andhra Pradesh</w:t>
+            </w:r>
+          </w:p>
+        </w:tc>
+        <w:tc>
+          <w:tcPr/>
+          <w:p>
+            <w:pPr>
+              <w:pStyle w:val="Compact"/>
+              <w:jc w:val="left"/>
+            </w:pPr>
+            <w:r>
+              <w:t xml:space="preserve">602</w:t>
+            </w:r>
+          </w:p>
+        </w:tc>
+        <w:tc>
+          <w:tcPr/>
+          <w:p>
+            <w:pPr>
+              <w:pStyle w:val="Compact"/>
+              <w:jc w:val="left"/>
+            </w:pPr>
+            <w:r>
+              <w:t xml:space="preserve">31.0</w:t>
+            </w:r>
+          </w:p>
+        </w:tc>
+        <w:tc>
+          <w:tcPr/>
+          <w:p>
+            <w:pPr>
+              <w:pStyle w:val="Compact"/>
+              <w:jc w:val="left"/>
+            </w:pPr>
+            <w:r>
+              <w:t xml:space="preserve">52.6</w:t>
+            </w:r>
+          </w:p>
+        </w:tc>
+        <w:tc>
+          <w:tcPr/>
+          <w:p>
+            <w:pPr>
+              <w:pStyle w:val="Compact"/>
+              <w:jc w:val="left"/>
+            </w:pPr>
+            <w:r>
+              <w:t xml:space="preserve">Moderate</w:t>
+            </w:r>
+          </w:p>
+        </w:tc>
+      </w:tr>
+      <w:tr>
+        <w:tc>
+          <w:tcPr/>
+          <w:p>
+            <w:pPr>
+              <w:pStyle w:val="Compact"/>
+              <w:jc w:val="left"/>
+            </w:pPr>
+            <w:r>
+              <w:t xml:space="preserve">Kerala</w:t>
+            </w:r>
+          </w:p>
+        </w:tc>
+        <w:tc>
+          <w:tcPr/>
+          <w:p>
+            <w:pPr>
+              <w:pStyle w:val="Compact"/>
+              <w:jc w:val="left"/>
+            </w:pPr>
+            <w:r>
+              <w:t xml:space="preserve">1,136</w:t>
+            </w:r>
+          </w:p>
+        </w:tc>
+        <w:tc>
+          <w:tcPr/>
+          <w:p>
+            <w:pPr>
+              <w:pStyle w:val="Compact"/>
+              <w:jc w:val="left"/>
+            </w:pPr>
+            <w:r>
+              <w:t xml:space="preserve">82.2</w:t>
+            </w:r>
+          </w:p>
+        </w:tc>
+        <w:tc>
+          <w:tcPr/>
+          <w:p>
+            <w:pPr>
+              <w:pStyle w:val="Compact"/>
+              <w:jc w:val="left"/>
+            </w:pPr>
+            <w:r>
+              <w:t xml:space="preserve">50.1</w:t>
+            </w:r>
+          </w:p>
+        </w:tc>
+        <w:tc>
+          <w:tcPr/>
+          <w:p>
+            <w:pPr>
+              <w:pStyle w:val="Compact"/>
+              <w:jc w:val="left"/>
+            </w:pPr>
+            <w:r>
+              <w:t xml:space="preserve">Moderate</w:t>
+            </w:r>
+          </w:p>
+        </w:tc>
+      </w:tr>
+      <w:tr>
+        <w:tc>
+          <w:tcPr/>
+          <w:p>
+            <w:pPr>
+              <w:pStyle w:val="Compact"/>
+              <w:jc w:val="left"/>
+            </w:pPr>
+            <w:r>
+              <w:t xml:space="preserve">Haryana</w:t>
+            </w:r>
+          </w:p>
+        </w:tc>
+        <w:tc>
+          <w:tcPr/>
+          <w:p>
+            <w:pPr>
+              <w:pStyle w:val="Compact"/>
+              <w:jc w:val="left"/>
+            </w:pPr>
+            <w:r>
+              <w:t xml:space="preserve">689</w:t>
+            </w:r>
+          </w:p>
+        </w:tc>
+        <w:tc>
+          <w:tcPr/>
+          <w:p>
+            <w:pPr>
+              <w:pStyle w:val="Compact"/>
+              <w:jc w:val="left"/>
+            </w:pPr>
+            <w:r>
+              <w:t xml:space="preserve">44.3</w:t>
+            </w:r>
+          </w:p>
+        </w:tc>
+        <w:tc>
+          <w:tcPr/>
+          <w:p>
+            <w:pPr>
+              <w:pStyle w:val="Compact"/>
+              <w:jc w:val="left"/>
+            </w:pPr>
+            <w:r>
+              <w:t xml:space="preserve">50.0</w:t>
+            </w:r>
+          </w:p>
+        </w:tc>
+        <w:tc>
+          <w:tcPr/>
+          <w:p>
+            <w:pPr>
+              <w:pStyle w:val="Compact"/>
+              <w:jc w:val="left"/>
+            </w:pPr>
+            <w:r>
+              <w:t xml:space="preserve">Moderate</w:t>
+            </w:r>
+          </w:p>
+        </w:tc>
+      </w:tr>
+      <w:tr>
+        <w:tc>
+          <w:tcPr/>
+          <w:p>
+            <w:pPr>
+              <w:pStyle w:val="Compact"/>
+              <w:jc w:val="left"/>
+            </w:pPr>
+            <w:r>
+              <w:t xml:space="preserve">Gujarat</w:t>
+            </w:r>
+          </w:p>
+        </w:tc>
+        <w:tc>
+          <w:tcPr/>
+          <w:p>
+            <w:pPr>
+              <w:pStyle w:val="Compact"/>
+              <w:jc w:val="left"/>
+            </w:pPr>
+            <w:r>
+              <w:t xml:space="preserve">617</w:t>
+            </w:r>
+          </w:p>
+        </w:tc>
+        <w:tc>
+          <w:tcPr/>
+          <w:p>
+            <w:pPr>
+              <w:pStyle w:val="Compact"/>
+              <w:jc w:val="left"/>
+            </w:pPr>
+            <w:r>
+              <w:t xml:space="preserve">44.2</w:t>
+            </w:r>
+          </w:p>
+        </w:tc>
+        <w:tc>
+          <w:tcPr/>
+          <w:p>
+            <w:pPr>
+              <w:pStyle w:val="Compact"/>
+              <w:jc w:val="left"/>
+            </w:pPr>
+            <w:r>
+              <w:t xml:space="preserve">43.1</w:t>
+            </w:r>
+          </w:p>
+        </w:tc>
+        <w:tc>
+          <w:tcPr/>
+          <w:p>
+            <w:pPr>
+              <w:pStyle w:val="Compact"/>
+              <w:jc w:val="left"/>
+            </w:pPr>
+            <w:r>
+              <w:t xml:space="preserve">Moderate</w:t>
+            </w:r>
+          </w:p>
+        </w:tc>
+      </w:tr>
+      <w:tr>
+        <w:tc>
+          <w:tcPr/>
+          <w:p>
+            <w:pPr>
+              <w:pStyle w:val="Compact"/>
+              <w:jc w:val="left"/>
+            </w:pPr>
+            <w:r>
+              <w:t xml:space="preserve">Telangana</w:t>
+            </w:r>
+          </w:p>
+        </w:tc>
+        <w:tc>
+          <w:tcPr/>
+          <w:p>
+            <w:pPr>
+              <w:pStyle w:val="Compact"/>
+              <w:jc w:val="left"/>
+            </w:pPr>
+            <w:r>
+              <w:t xml:space="preserve">603</w:t>
+            </w:r>
+          </w:p>
+        </w:tc>
+        <w:tc>
+          <w:tcPr/>
+          <w:p>
+            <w:pPr>
+              <w:pStyle w:val="Compact"/>
+              <w:jc w:val="left"/>
+            </w:pPr>
+            <w:r>
+              <w:t xml:space="preserve">47.6</w:t>
+            </w:r>
+          </w:p>
+        </w:tc>
+        <w:tc>
+          <w:tcPr/>
+          <w:p>
+            <w:pPr>
+              <w:pStyle w:val="Compact"/>
+              <w:jc w:val="left"/>
+            </w:pPr>
+            <w:r>
+              <w:t xml:space="preserve">38.8</w:t>
+            </w:r>
+          </w:p>
+        </w:tc>
+        <w:tc>
+          <w:tcPr/>
+          <w:p>
+            <w:pPr>
+              <w:pStyle w:val="Compact"/>
+              <w:jc w:val="left"/>
+            </w:pPr>
+            <w:r>
+              <w:t xml:space="preserve">Low</w:t>
+            </w:r>
+          </w:p>
+        </w:tc>
+      </w:tr>
+      <w:tr>
+        <w:tc>
+          <w:tcPr/>
+          <w:p>
+            <w:pPr>
+              <w:pStyle w:val="Compact"/>
+              <w:jc w:val="left"/>
+            </w:pPr>
+            <w:r>
+              <w:t xml:space="preserve">Odisha</w:t>
+            </w:r>
+          </w:p>
+        </w:tc>
+        <w:tc>
+          <w:tcPr/>
+          <w:p>
+            <w:pPr>
+              <w:pStyle w:val="Compact"/>
+              <w:jc w:val="left"/>
+            </w:pPr>
+            <w:r>
+              <w:t xml:space="preserve">485</w:t>
+            </w:r>
+          </w:p>
+        </w:tc>
+        <w:tc>
+          <w:tcPr/>
+          <w:p>
+            <w:pPr>
+              <w:pStyle w:val="Compact"/>
+              <w:jc w:val="left"/>
+            </w:pPr>
+            <w:r>
+              <w:t xml:space="preserve">58.1</w:t>
+            </w:r>
+          </w:p>
+        </w:tc>
+        <w:tc>
+          <w:tcPr/>
+          <w:p>
+            <w:pPr>
+              <w:pStyle w:val="Compact"/>
+              <w:jc w:val="left"/>
+            </w:pPr>
+            <w:r>
+              <w:t xml:space="preserve">16.2</w:t>
+            </w:r>
+          </w:p>
+        </w:tc>
+        <w:tc>
+          <w:tcPr/>
+          <w:p>
+            <w:pPr>
+              <w:pStyle w:val="Compact"/>
+              <w:jc w:val="left"/>
+            </w:pPr>
+            <w:r>
+              <w:t xml:space="preserve">Low</w:t>
+            </w:r>
+          </w:p>
+        </w:tc>
+      </w:tr>
+      <w:tr>
+        <w:tc>
+          <w:tcPr/>
+          <w:p>
+            <w:pPr>
+              <w:pStyle w:val="Compact"/>
+              <w:jc w:val="left"/>
+            </w:pPr>
+            <w:r>
+              <w:t xml:space="preserve">Uttar Pradesh</w:t>
+            </w:r>
+          </w:p>
+        </w:tc>
+        <w:tc>
+          <w:tcPr/>
+          <w:p>
+            <w:pPr>
+              <w:pStyle w:val="Compact"/>
+              <w:jc w:val="left"/>
+            </w:pPr>
+            <w:r>
+              <w:t xml:space="preserve">435</w:t>
+            </w:r>
+          </w:p>
+        </w:tc>
+        <w:tc>
+          <w:tcPr/>
+          <w:p>
+            <w:pPr>
+              <w:pStyle w:val="Compact"/>
+              <w:jc w:val="left"/>
+            </w:pPr>
+            <w:r>
+              <w:t xml:space="preserve">50.7</w:t>
+            </w:r>
+          </w:p>
+        </w:tc>
+        <w:tc>
+          <w:tcPr/>
+          <w:p>
+            <w:pPr>
+              <w:pStyle w:val="Compact"/>
+              <w:jc w:val="left"/>
+            </w:pPr>
+            <w:r>
+              <w:t xml:space="preserve">15.5</w:t>
+            </w:r>
+          </w:p>
+        </w:tc>
+        <w:tc>
+          <w:tcPr/>
+          <w:p>
+            <w:pPr>
+              <w:pStyle w:val="Compact"/>
+              <w:jc w:val="left"/>
+            </w:pPr>
+            <w:r>
+              <w:t xml:space="preserve">Low</w:t>
+            </w:r>
+          </w:p>
+        </w:tc>
+      </w:tr>
+      <w:tr>
+        <w:tc>
+          <w:tcPr/>
+          <w:p>
+            <w:pPr>
+              <w:pStyle w:val="Compact"/>
+              <w:jc w:val="left"/>
+            </w:pPr>
+            <w:r>
+              <w:t xml:space="preserve">Punjab</w:t>
+            </w:r>
+          </w:p>
+        </w:tc>
+        <w:tc>
+          <w:tcPr/>
+          <w:p>
+            <w:pPr>
+              <w:pStyle w:val="Compact"/>
+              <w:jc w:val="left"/>
+            </w:pPr>
+            <w:r>
+              <w:t xml:space="preserve">551</w:t>
+            </w:r>
+          </w:p>
+        </w:tc>
+        <w:tc>
+          <w:tcPr/>
+          <w:p>
+            <w:pPr>
+              <w:pStyle w:val="Compact"/>
+              <w:jc w:val="left"/>
+            </w:pPr>
+            <w:r>
+              <w:t xml:space="preserve">70.0</w:t>
+            </w:r>
+          </w:p>
+        </w:tc>
+        <w:tc>
+          <w:tcPr/>
+          <w:p>
+            <w:pPr>
+              <w:pStyle w:val="Compact"/>
+              <w:jc w:val="left"/>
+            </w:pPr>
+            <w:r>
+              <w:t xml:space="preserve">14.4</w:t>
+            </w:r>
+          </w:p>
+        </w:tc>
+        <w:tc>
+          <w:tcPr/>
+          <w:p>
+            <w:pPr>
+              <w:pStyle w:val="Compact"/>
+              <w:jc w:val="left"/>
+            </w:pPr>
+            <w:r>
+              <w:t xml:space="preserve">Low</w:t>
+            </w:r>
+          </w:p>
+        </w:tc>
+      </w:tr>
+      <w:tr>
+        <w:tc>
+          <w:tcPr/>
+          <w:p>
+            <w:pPr>
+              <w:pStyle w:val="Compact"/>
+              <w:jc w:val="left"/>
+            </w:pPr>
+            <w:r>
+              <w:t xml:space="preserve">Bihar</w:t>
+            </w:r>
+          </w:p>
+        </w:tc>
+        <w:tc>
+          <w:tcPr/>
+          <w:p>
+            <w:pPr>
+              <w:pStyle w:val="Compact"/>
+              <w:jc w:val="left"/>
+            </w:pPr>
+            <w:r>
+              <w:t xml:space="preserve">454</w:t>
+            </w:r>
+          </w:p>
+        </w:tc>
+        <w:tc>
+          <w:tcPr/>
+          <w:p>
+            <w:pPr>
+              <w:pStyle w:val="Compact"/>
+              <w:jc w:val="left"/>
+            </w:pPr>
+            <w:r>
+              <w:t xml:space="preserve">72.4</w:t>
+            </w:r>
+          </w:p>
+        </w:tc>
+        <w:tc>
+          <w:tcPr/>
+          <w:p>
+            <w:pPr>
+              <w:pStyle w:val="Compact"/>
+              <w:jc w:val="left"/>
+            </w:pPr>
+            <w:r>
+              <w:t xml:space="preserve">0.0</w:t>
+            </w:r>
+          </w:p>
+        </w:tc>
+        <w:tc>
+          <w:tcPr/>
+          <w:p>
+            <w:pPr>
+              <w:pStyle w:val="Compact"/>
+              <w:jc w:val="left"/>
+            </w:pPr>
+            <w:r>
+              <w:t xml:space="preserve">Low</w:t>
+            </w:r>
+          </w:p>
+        </w:tc>
+      </w:tr>
+    </w:tbl>
+    <w:p>
+      <w:pPr>
+        <w:pStyle w:val="BodyText"/>
+      </w:pPr>
+      <w:r>
+        <w:t xml:space="preserve">*West Bengal Health Index median-imputed (absent in source release).</w:t>
+      </w:r>
+    </w:p>
+    <w:bookmarkEnd w:id="18"/>
+    <w:bookmarkStart w:id="19" w:name="s11.-reproducibility"/>
+    <w:p>
+      <w:pPr>
+        <w:pStyle w:val="Heading2"/>
+      </w:pPr>
+      <w:r>
+        <w:t xml:space="preserve">S11. Reproducibility</w:t>
       </w:r>
     </w:p>
     <w:p>
@@ -1145,7 +2600,7 @@
         <w:pStyle w:val="FirstParagraph"/>
       </w:pPr>
       <w:r>
-        <w:t xml:space="preserve">Python 3 with scikit-learn, pandas, NumPy, SciPy, GeoPandas, Matplotlib, seaborn. Pipeline:</w:t>
+        <w:t xml:space="preserve">Python 3.14 with scikit-learn 1.7.2, pandas 2.3.3, NumPy 2.3.5, SciPy 1.16.3, GeoPandas 1.1.1, Matplotlib and seaborn. Pipeline:</w:t>
       </w:r>
       <w:r>
         <w:t xml:space="preserve"> </w:t>
@@ -1208,8 +2663,8 @@
         <w:t xml:space="preserve">(manuscript). Repository: https://github.com/hssling/Dengue_Outbreak_Prediction</w:t>
       </w:r>
     </w:p>
-    <w:bookmarkEnd w:id="17"/>
-    <w:bookmarkEnd w:id="18"/>
+    <w:bookmarkEnd w:id="19"/>
+    <w:bookmarkEnd w:id="20"/>
     <w:sectPr>
       <w:footnotePr>
         <w:numRestart w:val="eachSect"/>

</xml_diff>